<commit_message>
Revise AJBA analysis after critical review
Co-Authored-By: Tatsuki Onishi <bougtoir@gmail.com>
</commit_message>
<xml_diff>
--- a/denisovan-archaic-dna-analysis/docs/ajba_submission/Table_1_corrected_model.docx
+++ b/denisovan-archaic-dna-analysis/docs/ajba_submission/Table_1_corrected_model.docx
@@ -10,7 +10,7 @@
         <w:rPr>
           <w:b/>
         </w:rPr>
-        <w:t>Table 1. Corrected geographic-distance models and matrix-level tests</w:t>
+        <w:t>Table 1. Dependence-aware geographic-distance results</w:t>
       </w:r>
     </w:p>
     <w:tbl>
@@ -210,7 +210,7 @@
                 <w:b w:val="0"/>
                 <w:sz w:val="17"/>
               </w:rPr>
-              <w:t>-0.4847</w:t>
+              <w:t>-0.4971</w:t>
             </w:r>
           </w:p>
         </w:tc>
@@ -228,7 +228,7 @@
                 <w:b w:val="0"/>
                 <w:sz w:val="17"/>
               </w:rPr>
-              <w:t>-0.4656</w:t>
+              <w:t>-0.4617</w:t>
             </w:r>
           </w:p>
         </w:tc>
@@ -246,7 +246,7 @@
                 <w:b w:val="0"/>
                 <w:sz w:val="17"/>
               </w:rPr>
-              <w:t>Pairwise descriptive correlation</w:t>
+              <w:t>Descriptive pairwise correlation</w:t>
             </w:r>
           </w:p>
         </w:tc>
@@ -266,7 +266,7 @@
                 <w:b w:val="0"/>
                 <w:sz w:val="17"/>
               </w:rPr>
-              <w:t>Partial r</w:t>
+              <w:t>Expanded-model partial r</w:t>
             </w:r>
           </w:p>
         </w:tc>
@@ -284,7 +284,7 @@
                 <w:b w:val="0"/>
                 <w:sz w:val="17"/>
               </w:rPr>
-              <w:t>-0.3105</w:t>
+              <w:t>-0.3687</w:t>
             </w:r>
           </w:p>
         </w:tc>
@@ -302,7 +302,7 @@
                 <w:b w:val="0"/>
                 <w:sz w:val="17"/>
               </w:rPr>
-              <w:t>-0.3001</w:t>
+              <w:t>-0.3259</w:t>
             </w:r>
           </w:p>
         </w:tc>
@@ -320,7 +320,7 @@
                 <w:b w:val="0"/>
                 <w:sz w:val="17"/>
               </w:rPr>
-              <w:t>Controls maximum admixture and same continent</w:t>
+              <w:t>Distance after coarse sensitivity covariates</w:t>
             </w:r>
           </w:p>
         </w:tc>
@@ -358,7 +358,7 @@
                 <w:b w:val="0"/>
                 <w:sz w:val="17"/>
               </w:rPr>
-              <w:t>0.2350</w:t>
+              <w:t>0.2471</w:t>
             </w:r>
           </w:p>
         </w:tc>
@@ -376,7 +376,7 @@
                 <w:b w:val="0"/>
                 <w:sz w:val="17"/>
               </w:rPr>
-              <w:t>0.2167</w:t>
+              <w:t>0.2131</w:t>
             </w:r>
           </w:p>
         </w:tc>
@@ -394,7 +394,7 @@
                 <w:b w:val="0"/>
                 <w:sz w:val="17"/>
               </w:rPr>
-              <w:t>Uncorrected model</w:t>
+              <w:t>Descriptive matrix fit</w:t>
             </w:r>
           </w:p>
         </w:tc>
@@ -414,7 +414,7 @@
                 <w:b w:val="0"/>
                 <w:sz w:val="17"/>
               </w:rPr>
-              <w:t>Corrected R²</w:t>
+              <w:t>Expanded descriptive R²</w:t>
             </w:r>
           </w:p>
         </w:tc>
@@ -432,7 +432,7 @@
                 <w:b w:val="0"/>
                 <w:sz w:val="17"/>
               </w:rPr>
-              <w:t>0.5100</w:t>
+              <w:t>0.5461</w:t>
             </w:r>
           </w:p>
         </w:tc>
@@ -450,7 +450,7 @@
                 <w:b w:val="0"/>
                 <w:sz w:val="17"/>
               </w:rPr>
-              <w:t>0.4953</w:t>
+              <w:t>0.5113</w:t>
             </w:r>
           </w:p>
         </w:tc>
@@ -468,7 +468,7 @@
                 <w:b w:val="0"/>
                 <w:sz w:val="17"/>
               </w:rPr>
-              <w:t>Distance plus two confounders</w:t>
+              <w:t>Not an independent-pair causal estimate</w:t>
             </w:r>
           </w:p>
         </w:tc>
@@ -488,7 +488,7 @@
                 <w:b w:val="0"/>
                 <w:sz w:val="17"/>
               </w:rPr>
-              <w:t>Non-admixed Mantel r</w:t>
+              <w:t>QAP distance coefficient / 1,000 km</w:t>
             </w:r>
           </w:p>
         </w:tc>
@@ -506,7 +506,7 @@
                 <w:b w:val="0"/>
                 <w:sz w:val="17"/>
               </w:rPr>
-              <w:t>-0.6157</w:t>
+              <w:t>-0.01892</w:t>
             </w:r>
           </w:p>
         </w:tc>
@@ -524,7 +524,7 @@
                 <w:b w:val="0"/>
                 <w:sz w:val="17"/>
               </w:rPr>
-              <w:t>-0.5809</w:t>
+              <w:t>-0.01918</w:t>
             </w:r>
           </w:p>
         </w:tc>
@@ -542,7 +542,7 @@
                 <w:b w:val="0"/>
                 <w:sz w:val="17"/>
               </w:rPr>
-              <w:t>9,999 label permutations</w:t>
+              <w:t>Expanded model</w:t>
             </w:r>
           </w:p>
         </w:tc>
@@ -562,7 +562,7 @@
                 <w:b w:val="0"/>
                 <w:sz w:val="17"/>
               </w:rPr>
-              <w:t>Mantel p</w:t>
+              <w:t>QAP two-sided P</w:t>
             </w:r>
           </w:p>
         </w:tc>
@@ -598,7 +598,7 @@
                 <w:b w:val="0"/>
                 <w:sz w:val="17"/>
               </w:rPr>
-              <w:t>0.0001</w:t>
+              <w:t>0.0002</w:t>
             </w:r>
           </w:p>
         </w:tc>
@@ -616,7 +616,7 @@
                 <w:b w:val="0"/>
                 <w:sz w:val="17"/>
               </w:rPr>
-              <w:t>Matrix-level inference</w:t>
+              <w:t>9,999 population-label permutations</w:t>
             </w:r>
           </w:p>
         </w:tc>
@@ -636,7 +636,81 @@
                 <w:b w:val="0"/>
                 <w:sz w:val="17"/>
               </w:rPr>
-              <w:t>FDR q&lt;0.10 positive outliers</w:t>
+              <w:t>Population-deletion interval</w:t>
+            </w:r>
+          </w:p>
+        </w:tc>
+        <w:tc>
+          <w:tcPr>
+            <w:tcW w:type="dxa" w:w="2340"/>
+          </w:tcPr>
+          <w:p>
+            <w:pPr>
+              <w:spacing w:line="240" w:lineRule="auto"/>
+            </w:pPr>
+            <w:r>
+              <w:rPr>
+                <w:rFonts w:ascii="Arial" w:hAnsi="Arial"/>
+                <w:b w:val="0"/>
+                <w:sz w:val="17"/>
+              </w:rPr>
+              <w:t>-0.02143 to -0.01770</w:t>
+            </w:r>
+          </w:p>
+        </w:tc>
+        <w:tc>
+          <w:tcPr>
+            <w:tcW w:type="dxa" w:w="2340"/>
+          </w:tcPr>
+          <w:p>
+            <w:pPr>
+              <w:spacing w:line="240" w:lineRule="auto"/>
+            </w:pPr>
+            <w:r>
+              <w:rPr>
+                <w:rFonts w:ascii="Arial" w:hAnsi="Arial"/>
+                <w:b w:val="0"/>
+                <w:sz w:val="17"/>
+              </w:rPr>
+              <w:t>-0.02112 to -0.01775</w:t>
+            </w:r>
+          </w:p>
+        </w:tc>
+        <w:tc>
+          <w:tcPr>
+            <w:tcW w:type="dxa" w:w="2340"/>
+          </w:tcPr>
+          <w:p>
+            <w:pPr>
+              <w:spacing w:line="240" w:lineRule="auto"/>
+            </w:pPr>
+            <w:r>
+              <w:rPr>
+                <w:rFonts w:ascii="Arial" w:hAnsi="Arial"/>
+                <w:b w:val="0"/>
+                <w:sz w:val="17"/>
+              </w:rPr>
+              <w:t>2.5th-97.5th percentile sensitivity interval</w:t>
+            </w:r>
+          </w:p>
+        </w:tc>
+      </w:tr>
+      <w:tr>
+        <w:tc>
+          <w:tcPr>
+            <w:tcW w:type="dxa" w:w="2340"/>
+          </w:tcPr>
+          <w:p>
+            <w:pPr>
+              <w:spacing w:line="240" w:lineRule="auto"/>
+            </w:pPr>
+            <w:r>
+              <w:rPr>
+                <w:rFonts w:ascii="Arial" w:hAnsi="Arial"/>
+                <w:b w:val="0"/>
+                <w:sz w:val="17"/>
+              </w:rPr>
+              <w:t>FDR q&lt;0.10 and positive z&gt;2 outliers</w:t>
             </w:r>
           </w:p>
         </w:tc>
@@ -690,7 +764,7 @@
                 <w:b w:val="0"/>
                 <w:sz w:val="17"/>
               </w:rPr>
-              <w:t>Non-admixed pairs</w:t>
+              <w:t>All non-admixed pairs tested within ancestry</w:t>
             </w:r>
           </w:p>
         </w:tc>
@@ -704,7 +778,7 @@
         <w:rPr>
           <w:sz w:val="18"/>
         </w:rPr>
-        <w:t>Note. Partial correlations use pairwise rows and should not be interpreted as independent-sample inference. Mantel tests used non-admixed population matrices.</w:t>
+        <w:t>Note. R-squared and correlation values are descriptive. QAP tests permute population labels on the response matrix. Population-deletion intervals are sensitivity summaries, not independent-sample confidence intervals.</w:t>
       </w:r>
     </w:p>
     <w:sectPr>

</xml_diff>